<commit_message>
fix: pin every date a producer stamped and refuse a zip that is not a package
</commit_message>
<xml_diff>
--- a/__fixtures__/producers/google-docs-export.docx
+++ b/__fixtures__/producers/google-docs-export.docx
@@ -160,7 +160,7 @@
         </w:rPr>
         <w:t xml:space="preserve"> left in on purpose, so that the importer meets revision markup it has no mo</w:t>
       </w:r>
-      <w:ins w:author="Reviewer A" w:id="0" w:date="2026-09-07T04:21:35Z">
+      <w:ins w:author="Reviewer A" w:id="0" w:date="2026-01-01T00:00:00Z">
         <w:r>
           <w:rPr>
             <w:sz w:val="22"/>
@@ -2482,7 +2482,7 @@
 
 <file path=word/comments.xml><?xml version="1.0" encoding="utf-8"?>
 <w:comments xmlns:mc="http://schemas.openxmlformats.org/markup-compatibility/2006" xmlns:o="urn:schemas-microsoft-com:office:office" xmlns:r="http://schemas.openxmlformats.org/officeDocument/2006/relationships" xmlns:m="http://schemas.openxmlformats.org/officeDocument/2006/math" xmlns:v="urn:schemas-microsoft-com:vml" xmlns:wp="http://schemas.openxmlformats.org/drawingml/2006/wordprocessingDrawing" xmlns:w10="urn:schemas-microsoft-com:office:word" xmlns:w="http://schemas.openxmlformats.org/wordprocessingml/2006/main" xmlns:wne="http://schemas.microsoft.com/office/word/2006/wordml" xmlns:sl="http://schemas.openxmlformats.org/schemaLibrary/2006/main" xmlns:a="http://schemas.openxmlformats.org/drawingml/2006/main" xmlns:pic="http://schemas.openxmlformats.org/drawingml/2006/picture" xmlns:c="http://schemas.openxmlformats.org/drawingml/2006/chart" xmlns:lc="http://schemas.openxmlformats.org/drawingml/2006/lockedCanvas" xmlns:dgm="http://schemas.openxmlformats.org/drawingml/2006/diagram" xmlns:wps="http://schemas.microsoft.com/office/word/2010/wordprocessingShape" xmlns:wpg="http://schemas.microsoft.com/office/word/2010/wordprocessingGroup" xmlns:w14="http://schemas.microsoft.com/office/word/2010/wordml" xmlns:w15="http://schemas.microsoft.com/office/word/2012/wordml" xmlns:w16="http://schemas.microsoft.com/office/word/2018/wordml" xmlns:w16cex="http://schemas.microsoft.com/office/word/2018/wordml/cex" xmlns:w16cid="http://schemas.microsoft.com/office/word/2016/wordml/cid" xmlns="http://schemas.microsoft.com/office/tasks/2019/documenttasks" xmlns:cr="http://schemas.microsoft.com/office/comments/2020/reactions">
-  <w:comment w:author="Reviewer A" w:id="0" w:date="2026-08-22T00:00:00Z">
+  <w:comment w:author="Reviewer A" w:id="0" w:date="2026-01-01T00:00:00Z">
     <w:p>
       <w:pPr>
         <w:keepNext w:val="0"/>

</xml_diff>

<commit_message>
test: say what the producer made of the bookmark instead of what was asked of it
</commit_message>
<xml_diff>
--- a/__fixtures__/producers/google-docs-export.docx
+++ b/__fixtures__/producers/google-docs-export.docx
@@ -318,7 +318,7 @@
           <w:szCs w:val="22"/>
           <w:rtl w:val="0"/>
         </w:rPr>
-        <w:t xml:space="preserve">Three constructs in the body arrive as placeholders rather than as nodes: the suggested edit above, and the pair of markers around the named range further down. A snapshot beside the tests records all three, so a change in what this document keeps is approved rather than noticed later.</w:t>
+        <w:t xml:space="preserve">Three constructs in the body arrive as placeholders rather than as nodes: the suggested edit above, and the two markers that make up the bookmark further down. A snapshot beside the tests records all three, so a change in what this document keeps is approved rather than noticed later.</w:t>
       </w:r>
       <w:r>
         <w:rPr>
@@ -2127,7 +2127,7 @@
         <w:rPr>
           <w:rtl w:val="0"/>
         </w:rPr>
-        <w:t xml:space="preserve">A bookmark is an invisible named range. </w:t>
+        <w:t xml:space="preserve">A bookmark is an invisible named range, and the one in this paragraph was set around its second sentence. </w:t>
       </w:r>
       <w:bookmarkStart w:colFirst="0" w:colLast="0" w:name="po7aolf5216n" w:id="0"/>
       <w:bookmarkEnd w:id="0"/>
@@ -2135,7 +2135,7 @@
         <w:rPr>
           <w:rtl w:val="0"/>
         </w:rPr>
-        <w:t xml:space="preserve">This sentence sits inside one, under a name the producer generated rather than one an author chose.</w:t>
+        <w:t xml:space="preserve">A producer may save that range as it was or collapse it to a point between the two sentences, and the notes kept with this fixture say which this file did; either way the name is one the producer generated rather than one an author chose.</w:t>
       </w:r>
     </w:p>
     <w:p>

</xml_diff>